<commit_message>
Devpost input: add the public GitHub link
</commit_message>
<xml_diff>
--- a/submission/Devpost input from Tim.docx
+++ b/submission/Devpost input from Tim.docx
@@ -974,7 +974,7 @@
         </w:rPr>
         <w:t xml:space="preserve">Live app: </w:t>
       </w:r>
-      <w:hyperlink w:history="1" r:id="rIdvzn6hhrpcgcjwimywo6e4">
+      <w:hyperlink w:history="1" r:id="rId6l3xpu8snhtazaxsiqo4q">
         <w:r>
           <w:rPr>
             <w:rStyle w:val="Hyperlink"/>
@@ -999,7 +999,7 @@
         </w:rPr>
         <w:t xml:space="preserve">Maya, v2 licence (Evidence ready): </w:t>
       </w:r>
-      <w:hyperlink w:history="1" r:id="rIdleoudzfrbsp7o_sb3cgeo">
+      <w:hyperlink w:history="1" r:id="rId4ns-ijigwizfato-xzd3u">
         <w:r>
           <w:rPr>
             <w:rStyle w:val="Hyperlink"/>
@@ -1024,7 +1024,7 @@
         </w:rPr>
         <w:t xml:space="preserve">Maya, what-if v3 licence (Evidence gap): </w:t>
       </w:r>
-      <w:hyperlink w:history="1" r:id="rId-rndk32v76n8gra9apewa">
+      <w:hyperlink w:history="1" r:id="rIdzhrboxmnhltytboksuy4f">
         <w:r>
           <w:rPr>
             <w:rStyle w:val="Hyperlink"/>
@@ -1049,7 +1049,7 @@
         </w:rPr>
         <w:t xml:space="preserve">Leo, counter-notice with the licensor email flip: </w:t>
       </w:r>
-      <w:hyperlink w:history="1" r:id="rIdj8u5prxecvome3gohg8wu">
+      <w:hyperlink w:history="1" r:id="rIdbyaknifwynzrxussqrda8">
         <w:r>
           <w:rPr>
             <w:rStyle w:val="Hyperlink"/>
@@ -1074,7 +1074,7 @@
         </w:rPr>
         <w:t xml:space="preserve">Benchmark page with every raw output: </w:t>
       </w:r>
-      <w:hyperlink w:history="1" r:id="rIdpvhqfhbhrzapo20k2gqas">
+      <w:hyperlink w:history="1" r:id="rIdwwlww9ixrw1nhfgvmfgox">
         <w:r>
           <w:rPr>
             <w:rStyle w:val="Hyperlink"/>
@@ -1099,7 +1099,7 @@
         </w:rPr>
         <w:t xml:space="preserve">API health check: </w:t>
       </w:r>
-      <w:hyperlink w:history="1" r:id="rIdghu8gzp9vuhn8qsewsksl">
+      <w:hyperlink w:history="1" r:id="rIdakv0mum4tvl3tk3btqyfm">
         <w:r>
           <w:rPr>
             <w:rStyle w:val="Hyperlink"/>
@@ -1110,16 +1110,28 @@
     </w:p>
     <w:p>
       <w:pPr>
-        <w:spacing w:after="120"/>
-      </w:pPr>
-      <w:r>
-        <w:rPr>
-          <w:i/>
-          <w:iCs/>
-          <w:color w:val="8A3B12"/>
-        </w:rPr>
-        <w:t xml:space="preserve">Note for Tim: the code repository has not been pushed to any remote. Devpost accepts a live URL instead of a repository, but a public GitHub link is worth adding if there is time. Add it here when it exists.</w:t>
-      </w:r>
+        <w:pStyle w:val="ListParagraph"/>
+        <w:numPr>
+          <w:ilvl w:val="0"/>
+          <w:numId w:val="2"/>
+        </w:numPr>
+        <w:spacing w:after="60"/>
+      </w:pPr>
+      <w:r>
+        <w:rPr>
+          <w:b/>
+          <w:bCs/>
+        </w:rPr>
+        <w:t xml:space="preserve">Source code (public GitHub): </w:t>
+      </w:r>
+      <w:hyperlink w:history="1" r:id="rIdftzw8tyqrdocpwv82nleg">
+        <w:r>
+          <w:rPr>
+            <w:rStyle w:val="Hyperlink"/>
+          </w:rPr>
+          <w:t xml:space="preserve">https://github.com/cvikl/noticeguard</w:t>
+        </w:r>
+      </w:hyperlink>
     </w:p>
     <w:sectPr>
       <w:pgSz w:w="11906" w:h="16838" w:orient="portrait"/>

</xml_diff>

<commit_message>
Add submission screenshots and captions
</commit_message>
<xml_diff>
--- a/submission/Devpost input from Tim.docx
+++ b/submission/Devpost input from Tim.docx
@@ -446,7 +446,7 @@
         <w:spacing w:after="120"/>
       </w:pPr>
       <w:r>
-        <w:t xml:space="preserve">Screenshots go in submission/media in the repository. Devpost prefers a 3:2 ratio, PNG or JPG, 5 MB max, up to 15 images. Suggested shot list and captions:</w:t>
+        <w:t xml:space="preserve">Four unedited screenshots of the deployed site are in submission/media in the repository (PNG, 1920 wide, all under 0.4 MB). Upload them to Devpost in this order with these captions:</w:t>
       </w:r>
     </w:p>
     <w:tbl>
@@ -608,7 +608,7 @@
                 <w:sz w:val="20"/>
                 <w:szCs w:val="20"/>
               </w:rPr>
-              <w:t xml:space="preserve">01-maya-v2-evidence-ready.png</w:t>
+              <w:t xml:space="preserve">01-home.png</w:t>
             </w:r>
           </w:p>
         </w:tc>
@@ -630,7 +630,7 @@
                 <w:sz w:val="20"/>
                 <w:szCs w:val="20"/>
               </w:rPr>
-              <w:t xml:space="preserve">1600 x 1200</w:t>
+              <w:t xml:space="preserve">1920 x 1033</w:t>
             </w:r>
           </w:p>
         </w:tc>
@@ -652,7 +652,7 @@
                 <w:sz w:val="20"/>
                 <w:szCs w:val="20"/>
               </w:rPr>
-              <w:t xml:space="preserve">Maya, v2 licence: Evidence ready for a dispute. First route is to ask the licensor to have Northline Rights release the claim.</w:t>
+              <w:t xml:space="preserve">Home screen: upload documents or open a demo case. The AI never writes a word of your evidence; it only highlights your own.</w:t>
             </w:r>
           </w:p>
         </w:tc>
@@ -701,7 +701,7 @@
                 <w:sz w:val="20"/>
                 <w:szCs w:val="20"/>
               </w:rPr>
-              <w:t xml:space="preserve">02-maya-v3-evidence-gap.png</w:t>
+              <w:t xml:space="preserve">02-maya-v2-evidence-view.png</w:t>
             </w:r>
           </w:p>
         </w:tc>
@@ -723,7 +723,7 @@
                 <w:sz w:val="20"/>
                 <w:szCs w:val="20"/>
               </w:rPr>
-              <w:t xml:space="preserve">1600 x 1200</w:t>
+              <w:t xml:space="preserve">1920 x 1036</w:t>
             </w:r>
           </w:p>
         </w:tc>
@@ -745,7 +745,7 @@
                 <w:sz w:val="20"/>
                 <w:szCs w:val="20"/>
               </w:rPr>
-              <w:t xml:space="preserve">Maya, what-if v3 purchase: Evidence gap. The monetised-use component is Not supported, with v3 §4.1 quoted from the certificate PDF.</w:t>
+              <w:t xml:space="preserve">Maya, v2 licence: the certificate PDF with highlights overlaid, the claim journey on the left, and the finding "Today's terms are not your purchase terms" with the exact quote from §6.1.</w:t>
             </w:r>
           </w:p>
         </w:tc>
@@ -794,7 +794,7 @@
                 <w:sz w:val="20"/>
                 <w:szCs w:val="20"/>
               </w:rPr>
-              <w:t xml:space="preserve">03-leo-counter-notice-gap.png</w:t>
+              <w:t xml:space="preserve">03-maya-v2-evidence-ready.png</w:t>
             </w:r>
           </w:p>
         </w:tc>
@@ -816,7 +816,7 @@
                 <w:sz w:val="20"/>
                 <w:szCs w:val="20"/>
               </w:rPr>
-              <w:t xml:space="preserve">1920 x 1080</w:t>
+              <w:t xml:space="preserve">1920 x 1037</w:t>
             </w:r>
           </w:p>
         </w:tc>
@@ -838,7 +838,7 @@
                 <w:sz w:val="20"/>
                 <w:szCs w:val="20"/>
               </w:rPr>
-              <w:t xml:space="preserve">Leo, counter-notice: Evidence gap until the licensor's email is added. The gap fix names the missing document.</w:t>
+              <w:t xml:space="preserve">Maya, v2 licence: Evidence ready for a dispute. Lowest-risk route first (ask the licensor to have Northline Rights release the claim); each statement component shows Supported with its quote and clause.</w:t>
             </w:r>
           </w:p>
         </w:tc>
@@ -887,7 +887,7 @@
                 <w:sz w:val="20"/>
                 <w:szCs w:val="20"/>
               </w:rPr>
-              <w:t xml:space="preserve">04-home-upload.png</w:t>
+              <w:t xml:space="preserve">04-maya-v3-evidence-gap.png</w:t>
             </w:r>
           </w:p>
         </w:tc>
@@ -909,7 +909,7 @@
                 <w:sz w:val="20"/>
                 <w:szCs w:val="20"/>
               </w:rPr>
-              <w:t xml:space="preserve">1920 x 1080</w:t>
+              <w:t xml:space="preserve">1920 x 1035</w:t>
             </w:r>
           </w:p>
         </w:tc>
@@ -931,7 +931,7 @@
                 <w:sz w:val="20"/>
                 <w:szCs w:val="20"/>
               </w:rPr>
-              <w:t xml:space="preserve">Home screen: upload documents or open a demo case.</w:t>
+              <w:t xml:space="preserve">Maya, what-if v3 purchase: Evidence gap. The monetised-use component is Not supported, with v3 §4.1 quoted from the certificate. No draft is produced.</w:t>
             </w:r>
           </w:p>
         </w:tc>
@@ -974,7 +974,7 @@
         </w:rPr>
         <w:t xml:space="preserve">Live app: </w:t>
       </w:r>
-      <w:hyperlink w:history="1" r:id="rId6l3xpu8snhtazaxsiqo4q">
+      <w:hyperlink w:history="1" r:id="rIdtxlk2bhwdkmiylakjcbzo">
         <w:r>
           <w:rPr>
             <w:rStyle w:val="Hyperlink"/>
@@ -999,7 +999,7 @@
         </w:rPr>
         <w:t xml:space="preserve">Maya, v2 licence (Evidence ready): </w:t>
       </w:r>
-      <w:hyperlink w:history="1" r:id="rId4ns-ijigwizfato-xzd3u">
+      <w:hyperlink w:history="1" r:id="rIdz3uz3pqmpuprqh2jd6ej_">
         <w:r>
           <w:rPr>
             <w:rStyle w:val="Hyperlink"/>
@@ -1024,7 +1024,7 @@
         </w:rPr>
         <w:t xml:space="preserve">Maya, what-if v3 licence (Evidence gap): </w:t>
       </w:r>
-      <w:hyperlink w:history="1" r:id="rIdzhrboxmnhltytboksuy4f">
+      <w:hyperlink w:history="1" r:id="rIdt1krljhc8g3wydkh0egsv">
         <w:r>
           <w:rPr>
             <w:rStyle w:val="Hyperlink"/>
@@ -1049,7 +1049,7 @@
         </w:rPr>
         <w:t xml:space="preserve">Leo, counter-notice with the licensor email flip: </w:t>
       </w:r>
-      <w:hyperlink w:history="1" r:id="rIdbyaknifwynzrxussqrda8">
+      <w:hyperlink w:history="1" r:id="rIdv9yxeezxi3h7nej4to2sf">
         <w:r>
           <w:rPr>
             <w:rStyle w:val="Hyperlink"/>
@@ -1074,7 +1074,7 @@
         </w:rPr>
         <w:t xml:space="preserve">Benchmark page with every raw output: </w:t>
       </w:r>
-      <w:hyperlink w:history="1" r:id="rIdwwlww9ixrw1nhfgvmfgox">
+      <w:hyperlink w:history="1" r:id="rIdjqq-lkajfn3i_1tkxrtnd">
         <w:r>
           <w:rPr>
             <w:rStyle w:val="Hyperlink"/>
@@ -1099,7 +1099,7 @@
         </w:rPr>
         <w:t xml:space="preserve">API health check: </w:t>
       </w:r>
-      <w:hyperlink w:history="1" r:id="rIdakv0mum4tvl3tk3btqyfm">
+      <w:hyperlink w:history="1" r:id="rIdcb0htobx_nnj27bk5zpmf">
         <w:r>
           <w:rPr>
             <w:rStyle w:val="Hyperlink"/>
@@ -1124,7 +1124,7 @@
         </w:rPr>
         <w:t xml:space="preserve">Source code (public GitHub): </w:t>
       </w:r>
-      <w:hyperlink w:history="1" r:id="rIdftzw8tyqrdocpwv82nleg">
+      <w:hyperlink w:history="1" r:id="rIdsfkg08nqmilhmes90jrsw">
         <w:r>
           <w:rPr>
             <w:rStyle w:val="Hyperlink"/>

</xml_diff>